<commit_message>
docs: remove headers and footers, update team members to Jai Subiksha T and Sanjay AR (Team 2)
</commit_message>
<xml_diff>
--- a/1_GAN_Results_and_Model_Comparison.docx
+++ b/1_GAN_Results_and_Model_Comparison.docx
@@ -24,7 +24,7 @@
         <w:rPr>
           <w:rFonts w:ascii="Calibri" w:hAnsi="Calibri"/>
           <w:color w:val="64748B"/>
-          <w:sz w:val="23"/>
+          <w:sz w:val="22"/>
         </w:rPr>
         <w:t>Empirical Assessment of Adversarial Discriminators vs. Multimodal Bimodal Fusion in KYC Forgery Detection</w:t>
       </w:r>
@@ -145,7 +145,7 @@
                 <w:color w:val="64748B"/>
                 <w:sz w:val="16"/>
               </w:rPr>
-              <w:t>TEAM MEMBERS</w:t>
+              <w:t>TEAM NO</w:t>
               <w:br/>
             </w:r>
             <w:r>
@@ -155,7 +155,7 @@
                 <w:color w:val="1B365D"/>
                 <w:sz w:val="19"/>
               </w:rPr>
-              <w:t>Jai &amp; Sanjay</w:t>
+              <w:t>2</w:t>
             </w:r>
           </w:p>
         </w:tc>
@@ -181,7 +181,7 @@
                 <w:color w:val="64748B"/>
                 <w:sz w:val="16"/>
               </w:rPr>
-              <w:t>DATE</w:t>
+              <w:t>TEAM MEMBERS</w:t>
               <w:br/>
             </w:r>
             <w:r>
@@ -191,7 +191,7 @@
                 <w:color w:val="1B365D"/>
                 <w:sz w:val="19"/>
               </w:rPr>
-              <w:t>October 2026</w:t>
+              <w:t>Jai Subiksha T &amp; Sanjay AR</w:t>
             </w:r>
           </w:p>
         </w:tc>
@@ -1980,11 +1980,8 @@
   <w:p>
     <w:pPr>
       <w:pStyle w:val="Footer"/>
-      <w:jc w:val="center"/>
-    </w:pPr>
-    <w:r>
-      <w:t>Confidential — Deep Learning Technical Deliverable (Review 3 Submission)</w:t>
-    </w:r>
+    </w:pPr>
+    <w:r/>
   </w:p>
 </w:ftr>
 </file>
@@ -1994,11 +1991,8 @@
   <w:p>
     <w:pPr>
       <w:pStyle w:val="Header"/>
-      <w:jc w:val="right"/>
-    </w:pPr>
-    <w:r>
-      <w:t>GROGU-KYC Project | Deliverable 1: GAN Baseline vs GROGU</w:t>
-    </w:r>
+    </w:pPr>
+    <w:r/>
   </w:p>
 </w:hdr>
 </file>
@@ -2381,11 +2375,6 @@
       </w:tabs>
       <w:spacing w:after="0" w:line="240" w:lineRule="auto"/>
     </w:pPr>
-    <w:rPr>
-      <w:rFonts w:ascii="Calibri" w:hAnsi="Calibri"/>
-      <w:color w:val="8C96A5"/>
-      <w:sz w:val="17"/>
-    </w:rPr>
   </w:style>
   <w:style w:type="character" w:customStyle="1" w:styleId="HeaderChar">
     <w:name w:val="Header Char"/>
@@ -2408,11 +2397,6 @@
       </w:tabs>
       <w:spacing w:after="0" w:line="240" w:lineRule="auto"/>
     </w:pPr>
-    <w:rPr>
-      <w:rFonts w:ascii="Calibri" w:hAnsi="Calibri"/>
-      <w:color w:val="A0AAB9"/>
-      <w:sz w:val="17"/>
-    </w:rPr>
   </w:style>
   <w:style w:type="character" w:customStyle="1" w:styleId="FooterChar">
     <w:name w:val="Footer Char"/>

</xml_diff>